<commit_message>
dbh density added into report
</commit_message>
<xml_diff>
--- a/Report.docx
+++ b/Report.docx
@@ -579,13 +579,13 @@
           <w:sz w:val="24"/>
           <w:szCs w:val="24"/>
         </w:rPr>
-      </w:r>
-      <w:r>
-        <w:rPr>
-          <w:sz w:val="24"/>
-          <w:szCs w:val="24"/>
-        </w:rPr>
         <w:instrText xml:space="preserve"> \* MERGEFORMAT </w:instrText>
+      </w:r>
+      <w:r>
+        <w:rPr>
+          <w:sz w:val="24"/>
+          <w:szCs w:val="24"/>
+        </w:rPr>
       </w:r>
       <w:r>
         <w:rPr>
@@ -653,6 +653,7 @@
       </w:pPr>
       <w:r>
         <w:rPr>
+          <w:noProof/>
           <w:sz w:val="24"/>
           <w:szCs w:val="24"/>
         </w:rPr>
@@ -706,11 +707,20 @@
         <w:jc w:val="center"/>
         <w:rPr>
           <w:color w:val="auto"/>
-          <w:sz w:val="24"/>
-          <w:szCs w:val="24"/>
         </w:rPr>
       </w:pPr>
       <w:bookmarkStart w:id="0" w:name="_Ref186747282"/>
+    </w:p>
+    <w:p>
+      <w:pPr>
+        <w:pStyle w:val="Caption"/>
+        <w:jc w:val="center"/>
+        <w:rPr>
+          <w:color w:val="auto"/>
+          <w:sz w:val="24"/>
+          <w:szCs w:val="24"/>
+        </w:rPr>
+      </w:pPr>
       <w:r>
         <w:rPr>
           <w:color w:val="auto"/>
@@ -781,12 +791,263 @@
     <w:p/>
     <w:p>
       <w:pPr>
+        <w:pStyle w:val="Heading3"/>
+      </w:pPr>
+      <w:r>
+        <w:t>Diameter at Breast Height</w:t>
+      </w:r>
+    </w:p>
+    <w:p>
+      <w:pPr>
+        <w:jc w:val="both"/>
+        <w:rPr>
+          <w:sz w:val="24"/>
+          <w:szCs w:val="24"/>
+        </w:rPr>
+      </w:pPr>
+      <w:r>
+        <w:rPr>
+          <w:sz w:val="24"/>
+          <w:szCs w:val="24"/>
+        </w:rPr>
+        <w:t>Diameter at breast height (DBH) is a standard forestry measurement representing the tree's diameter at 1.37 meters above the ground. It is calculated as the mean of d1 and d2, which are perpendicular diameter measurements taken at breast height to account for irregular trunk shapes</w:t>
+      </w:r>
+      <w:r>
+        <w:rPr>
+          <w:sz w:val="24"/>
+          <w:szCs w:val="24"/>
+        </w:rPr>
+        <w:t xml:space="preserve">. </w:t>
+      </w:r>
+      <w:r>
+        <w:rPr>
+          <w:sz w:val="24"/>
+          <w:szCs w:val="24"/>
+        </w:rPr>
+        <w:fldChar w:fldCharType="begin"/>
+      </w:r>
+      <w:r>
+        <w:rPr>
+          <w:sz w:val="24"/>
+          <w:szCs w:val="24"/>
+        </w:rPr>
+        <w:instrText xml:space="preserve"> REF _Ref186801422 \h </w:instrText>
+      </w:r>
+      <w:r>
+        <w:rPr>
+          <w:sz w:val="24"/>
+          <w:szCs w:val="24"/>
+        </w:rPr>
+      </w:r>
+      <w:r>
+        <w:rPr>
+          <w:sz w:val="24"/>
+          <w:szCs w:val="24"/>
+        </w:rPr>
+        <w:fldChar w:fldCharType="separate"/>
+      </w:r>
+      <w:r>
+        <w:t xml:space="preserve">Figure </w:t>
+      </w:r>
+      <w:r>
+        <w:rPr>
+          <w:noProof/>
+        </w:rPr>
+        <w:t>2</w:t>
+      </w:r>
+      <w:r>
+        <w:rPr>
+          <w:sz w:val="24"/>
+          <w:szCs w:val="24"/>
+        </w:rPr>
+        <w:fldChar w:fldCharType="end"/>
+      </w:r>
+      <w:r>
+        <w:rPr>
+          <w:sz w:val="24"/>
+          <w:szCs w:val="24"/>
+        </w:rPr>
+        <w:t xml:space="preserve"> shows </w:t>
+      </w:r>
+      <w:r>
+        <w:rPr>
+          <w:sz w:val="24"/>
+          <w:szCs w:val="24"/>
+        </w:rPr>
+        <w:t xml:space="preserve">a right-skewed distribution, with most tree diameters concentrated between 10 and 30 units and peaking around 15–20. This indicates a dominance of smaller-diameter trees, with fewer larger </w:t>
+      </w:r>
+      <w:r>
+        <w:rPr>
+          <w:sz w:val="24"/>
+          <w:szCs w:val="24"/>
+        </w:rPr>
+        <w:t>ones</w:t>
+      </w:r>
+      <w:r>
+        <w:rPr>
+          <w:sz w:val="24"/>
+          <w:szCs w:val="24"/>
+        </w:rPr>
+        <w:t xml:space="preserve"> represented by the long tail.</w:t>
+      </w:r>
+    </w:p>
+    <w:p>
+      <w:pPr>
+        <w:jc w:val="both"/>
+        <w:rPr>
+          <w:sz w:val="24"/>
+          <w:szCs w:val="24"/>
+        </w:rPr>
+      </w:pPr>
+    </w:p>
+    <w:p>
+      <w:pPr>
+        <w:jc w:val="both"/>
+        <w:rPr>
+          <w:sz w:val="24"/>
+          <w:szCs w:val="24"/>
+        </w:rPr>
+      </w:pPr>
+    </w:p>
+    <w:p>
+      <w:pPr>
         <w:keepNext/>
+        <w:jc w:val="both"/>
+      </w:pPr>
+      <w:r>
+        <w:rPr>
+          <w:sz w:val="24"/>
+          <w:szCs w:val="24"/>
+        </w:rPr>
+        <w:drawing>
+          <wp:inline distT="0" distB="0" distL="0" distR="0" wp14:anchorId="36F3723D" wp14:editId="71BBD481">
+            <wp:extent cx="5943600" cy="3848735"/>
+            <wp:effectExtent l="0" t="0" r="0" b="0"/>
+            <wp:docPr id="1480313374" name="Picture 1" descr="A blue line graph with white text&#10;&#10;Description automatically generated"/>
+            <wp:cNvGraphicFramePr>
+              <a:graphicFrameLocks xmlns:a="http://schemas.openxmlformats.org/drawingml/2006/main" noChangeAspect="1"/>
+            </wp:cNvGraphicFramePr>
+            <a:graphic xmlns:a="http://schemas.openxmlformats.org/drawingml/2006/main">
+              <a:graphicData uri="http://schemas.openxmlformats.org/drawingml/2006/picture">
+                <pic:pic xmlns:pic="http://schemas.openxmlformats.org/drawingml/2006/picture">
+                  <pic:nvPicPr>
+                    <pic:cNvPr id="1480313374" name="Picture 1" descr="A blue line graph with white text&#10;&#10;Description automatically generated"/>
+                    <pic:cNvPicPr/>
+                  </pic:nvPicPr>
+                  <pic:blipFill>
+                    <a:blip r:embed="rId11"/>
+                    <a:stretch>
+                      <a:fillRect/>
+                    </a:stretch>
+                  </pic:blipFill>
+                  <pic:spPr>
+                    <a:xfrm>
+                      <a:off x="0" y="0"/>
+                      <a:ext cx="5943600" cy="3848735"/>
+                    </a:xfrm>
+                    <a:prstGeom prst="rect">
+                      <a:avLst/>
+                    </a:prstGeom>
+                  </pic:spPr>
+                </pic:pic>
+              </a:graphicData>
+            </a:graphic>
+          </wp:inline>
+        </w:drawing>
+      </w:r>
+    </w:p>
+    <w:p>
+      <w:pPr>
+        <w:keepNext/>
+        <w:jc w:val="both"/>
+      </w:pPr>
+    </w:p>
+    <w:p>
+      <w:pPr>
+        <w:pStyle w:val="Caption"/>
         <w:jc w:val="center"/>
+        <w:rPr>
+          <w:color w:val="auto"/>
+          <w:lang w:val="en-US"/>
+        </w:rPr>
+      </w:pPr>
+      <w:bookmarkStart w:id="1" w:name="_Ref186801422"/>
+      <w:r>
+        <w:rPr>
+          <w:color w:val="auto"/>
+        </w:rPr>
+        <w:t xml:space="preserve">Figure </w:t>
+      </w:r>
+      <w:r>
+        <w:rPr>
+          <w:color w:val="auto"/>
+        </w:rPr>
+        <w:fldChar w:fldCharType="begin"/>
+      </w:r>
+      <w:r>
+        <w:rPr>
+          <w:color w:val="auto"/>
+        </w:rPr>
+        <w:instrText xml:space="preserve"> SEQ Figure \* ARABIC </w:instrText>
+      </w:r>
+      <w:r>
+        <w:rPr>
+          <w:color w:val="auto"/>
+        </w:rPr>
+        <w:fldChar w:fldCharType="separate"/>
+      </w:r>
+      <w:r>
+        <w:rPr>
+          <w:noProof/>
+          <w:color w:val="auto"/>
+        </w:rPr>
+        <w:t>2</w:t>
+      </w:r>
+      <w:r>
+        <w:rPr>
+          <w:color w:val="auto"/>
+        </w:rPr>
+        <w:fldChar w:fldCharType="end"/>
+      </w:r>
+      <w:bookmarkEnd w:id="1"/>
+      <w:r>
+        <w:rPr>
+          <w:color w:val="auto"/>
+        </w:rPr>
+        <w:t xml:space="preserve"> </w:t>
+      </w:r>
+      <w:r>
+        <w:rPr>
+          <w:color w:val="auto"/>
+          <w:lang w:val="en-US"/>
+        </w:rPr>
+        <w:t>Density plot of Diameter at Breast Height (DBH) measurements</w:t>
+      </w:r>
+    </w:p>
+    <w:p>
+      <w:pPr>
+        <w:rPr>
+          <w:lang w:val="en-US"/>
+        </w:rPr>
+      </w:pPr>
+    </w:p>
+    <w:p>
+      <w:pPr>
+        <w:rPr>
+          <w:lang w:val="en-US"/>
+        </w:rPr>
+      </w:pPr>
+    </w:p>
+    <w:p>
+      <w:pPr>
+        <w:rPr>
+          <w:lang w:val="en-US"/>
+        </w:rPr>
       </w:pPr>
     </w:p>
     <w:sectPr>
-      <w:headerReference w:type="default" r:id="rId11"/>
+      <w:headerReference w:type="default" r:id="rId12"/>
+      <w:footerReference w:type="default" r:id="rId13"/>
       <w:pgSz w:w="12240" w:h="15840"/>
       <w:pgMar w:top="1440" w:right="1440" w:bottom="1440" w:left="1440" w:header="720" w:footer="720" w:gutter="0"/>
       <w:pgNumType w:start="1"/>
@@ -819,6 +1080,59 @@
     </w:p>
   </w:endnote>
 </w:endnotes>
+</file>
+
+<file path=word/footer1.xml><?xml version="1.0" encoding="utf-8"?>
+<w:ftr xmlns:wpc="http://schemas.microsoft.com/office/word/2010/wordprocessingCanvas" xmlns:cx="http://schemas.microsoft.com/office/drawing/2014/chartex" xmlns:cx1="http://schemas.microsoft.com/office/drawing/2015/9/8/chartex" xmlns:cx2="http://schemas.microsoft.com/office/drawing/2015/10/21/chartex" xmlns:cx3="http://schemas.microsoft.com/office/drawing/2016/5/9/chartex" xmlns:cx4="http://schemas.microsoft.com/office/drawing/2016/5/10/chartex" xmlns:cx5="http://schemas.microsoft.com/office/drawing/2016/5/11/chartex" xmlns:cx6="http://schemas.microsoft.com/office/drawing/2016/5/12/chartex" xmlns:cx7="http://schemas.microsoft.com/office/drawing/2016/5/13/chartex" xmlns:cx8="http://schemas.microsoft.com/office/drawing/2016/5/14/chartex" xmlns:mc="http://schemas.openxmlformats.org/markup-compatibility/2006" xmlns:aink="http://schemas.microsoft.com/office/drawing/2016/ink" xmlns:am3d="http://schemas.microsoft.com/office/drawing/2017/model3d" xmlns:o="urn:schemas-microsoft-com:office:office" xmlns:oel="http://schemas.microsoft.com/office/2019/extlst" xmlns:r="http://schemas.openxmlformats.org/officeDocument/2006/relationships" xmlns:m="http://schemas.openxmlformats.org/officeDocument/2006/math" xmlns:v="urn:schemas-microsoft-com:vml" xmlns:wp14="http://schemas.microsoft.com/office/word/2010/wordprocessingDrawing" xmlns:wp="http://schemas.openxmlformats.org/drawingml/2006/wordprocessingDrawing" xmlns:w10="urn:schemas-microsoft-com:office:word" xmlns:w="http://schemas.openxmlformats.org/wordprocessingml/2006/main" xmlns:w14="http://schemas.microsoft.com/office/word/2010/wordml" xmlns:w15="http://schemas.microsoft.com/office/word/2012/wordml" xmlns:w16cex="http://schemas.microsoft.com/office/word/2018/wordml/cex" xmlns:w16cid="http://schemas.microsoft.com/office/word/2016/wordml/cid" xmlns:w16="http://schemas.microsoft.com/office/word/2018/wordml" xmlns:w16du="http://schemas.microsoft.com/office/word/2023/wordml/word16du" xmlns:w16sdtdh="http://schemas.microsoft.com/office/word/2020/wordml/sdtdatahash" xmlns:w16sdtfl="http://schemas.microsoft.com/office/word/2024/wordml/sdtformatlock" xmlns:w16se="http://schemas.microsoft.com/office/word/2015/wordml/symex" xmlns:wpg="http://schemas.microsoft.com/office/word/2010/wordprocessingGroup" xmlns:wpi="http://schemas.microsoft.com/office/word/2010/wordprocessingInk" xmlns:wne="http://schemas.microsoft.com/office/word/2006/wordml" xmlns:wps="http://schemas.microsoft.com/office/word/2010/wordprocessingShape" mc:Ignorable="w14 w15 w16se w16cid w16 w16cex w16sdtdh w16sdtfl w16du wp14">
+  <w:sdt>
+    <w:sdtPr>
+      <w:id w:val="152265544"/>
+      <w:docPartObj>
+        <w:docPartGallery w:val="Page Numbers (Bottom of Page)"/>
+        <w:docPartUnique/>
+      </w:docPartObj>
+    </w:sdtPr>
+    <w:sdtEndPr>
+      <w:rPr>
+        <w:noProof/>
+      </w:rPr>
+    </w:sdtEndPr>
+    <w:sdtContent>
+      <w:p>
+        <w:pPr>
+          <w:pStyle w:val="Footer"/>
+          <w:jc w:val="center"/>
+        </w:pPr>
+        <w:r>
+          <w:fldChar w:fldCharType="begin"/>
+        </w:r>
+        <w:r>
+          <w:instrText xml:space="preserve"> PAGE   \* MERGEFORMAT </w:instrText>
+        </w:r>
+        <w:r>
+          <w:fldChar w:fldCharType="separate"/>
+        </w:r>
+        <w:r>
+          <w:rPr>
+            <w:noProof/>
+          </w:rPr>
+          <w:t>2</w:t>
+        </w:r>
+        <w:r>
+          <w:rPr>
+            <w:noProof/>
+          </w:rPr>
+          <w:fldChar w:fldCharType="end"/>
+        </w:r>
+      </w:p>
+    </w:sdtContent>
+  </w:sdt>
+  <w:p>
+    <w:pPr>
+      <w:pStyle w:val="Footer"/>
+    </w:pPr>
+  </w:p>
+</w:ftr>
 </file>
 
 <file path=word/footnotes.xml><?xml version="1.0" encoding="utf-8"?>
@@ -1970,6 +2284,7 @@
   <w:style w:type="character" w:default="1" w:styleId="DefaultParagraphFont">
     <w:name w:val="Default Paragraph Font"/>
     <w:uiPriority w:val="1"/>
+    <w:semiHidden/>
     <w:unhideWhenUsed/>
   </w:style>
   <w:style w:type="table" w:default="1" w:styleId="TableNormal">
@@ -2044,6 +2359,50 @@
       <w:sz w:val="18"/>
       <w:szCs w:val="18"/>
     </w:rPr>
+  </w:style>
+  <w:style w:type="paragraph" w:styleId="Header">
+    <w:name w:val="header"/>
+    <w:basedOn w:val="Normal"/>
+    <w:link w:val="HeaderChar"/>
+    <w:uiPriority w:val="99"/>
+    <w:unhideWhenUsed/>
+    <w:rsid w:val="00095C9C"/>
+    <w:pPr>
+      <w:tabs>
+        <w:tab w:val="center" w:pos="4680"/>
+        <w:tab w:val="right" w:pos="9360"/>
+      </w:tabs>
+      <w:spacing w:line="240" w:lineRule="auto"/>
+    </w:pPr>
+  </w:style>
+  <w:style w:type="character" w:customStyle="1" w:styleId="HeaderChar">
+    <w:name w:val="Header Char"/>
+    <w:basedOn w:val="DefaultParagraphFont"/>
+    <w:link w:val="Header"/>
+    <w:uiPriority w:val="99"/>
+    <w:rsid w:val="00095C9C"/>
+  </w:style>
+  <w:style w:type="paragraph" w:styleId="Footer">
+    <w:name w:val="footer"/>
+    <w:basedOn w:val="Normal"/>
+    <w:link w:val="FooterChar"/>
+    <w:uiPriority w:val="99"/>
+    <w:unhideWhenUsed/>
+    <w:rsid w:val="00095C9C"/>
+    <w:pPr>
+      <w:tabs>
+        <w:tab w:val="center" w:pos="4680"/>
+        <w:tab w:val="right" w:pos="9360"/>
+      </w:tabs>
+      <w:spacing w:line="240" w:lineRule="auto"/>
+    </w:pPr>
+  </w:style>
+  <w:style w:type="character" w:customStyle="1" w:styleId="FooterChar">
+    <w:name w:val="Footer Char"/>
+    <w:basedOn w:val="DefaultParagraphFont"/>
+    <w:link w:val="Footer"/>
+    <w:uiPriority w:val="99"/>
+    <w:rsid w:val="00095C9C"/>
   </w:style>
 </w:styles>
 </file>

</xml_diff>

<commit_message>
plot feature exploration added to report
</commit_message>
<xml_diff>
--- a/Report.docx
+++ b/Report.docx
@@ -717,31 +717,39 @@
         <w:jc w:val="center"/>
         <w:rPr>
           <w:color w:val="auto"/>
-          <w:sz w:val="24"/>
-          <w:szCs w:val="24"/>
+          <w:sz w:val="28"/>
+          <w:szCs w:val="28"/>
         </w:rPr>
       </w:pPr>
       <w:r>
         <w:rPr>
           <w:color w:val="auto"/>
+          <w:sz w:val="20"/>
+          <w:szCs w:val="20"/>
         </w:rPr>
         <w:t xml:space="preserve">Figure </w:t>
       </w:r>
       <w:r>
         <w:rPr>
           <w:color w:val="auto"/>
+          <w:sz w:val="20"/>
+          <w:szCs w:val="20"/>
         </w:rPr>
         <w:fldChar w:fldCharType="begin"/>
       </w:r>
       <w:r>
         <w:rPr>
           <w:color w:val="auto"/>
+          <w:sz w:val="20"/>
+          <w:szCs w:val="20"/>
         </w:rPr>
         <w:instrText xml:space="preserve"> SEQ Figure \* ARABIC </w:instrText>
       </w:r>
       <w:r>
         <w:rPr>
           <w:color w:val="auto"/>
+          <w:sz w:val="20"/>
+          <w:szCs w:val="20"/>
         </w:rPr>
         <w:fldChar w:fldCharType="separate"/>
       </w:r>
@@ -749,12 +757,16 @@
         <w:rPr>
           <w:noProof/>
           <w:color w:val="auto"/>
+          <w:sz w:val="20"/>
+          <w:szCs w:val="20"/>
         </w:rPr>
         <w:t>1</w:t>
       </w:r>
       <w:r>
         <w:rPr>
           <w:color w:val="auto"/>
+          <w:sz w:val="20"/>
+          <w:szCs w:val="20"/>
         </w:rPr>
         <w:fldChar w:fldCharType="end"/>
       </w:r>
@@ -762,6 +774,8 @@
       <w:r>
         <w:rPr>
           <w:color w:val="auto"/>
+          <w:sz w:val="20"/>
+          <w:szCs w:val="20"/>
           <w:lang w:val="en-US"/>
         </w:rPr>
         <w:t xml:space="preserve"> Tree Species Distribution in the Surveyed Area</w:t>
@@ -916,6 +930,7 @@
       </w:pPr>
       <w:r>
         <w:rPr>
+          <w:noProof/>
           <w:sz w:val="24"/>
           <w:szCs w:val="24"/>
         </w:rPr>
@@ -968,6 +983,8 @@
         <w:jc w:val="center"/>
         <w:rPr>
           <w:color w:val="auto"/>
+          <w:sz w:val="20"/>
+          <w:szCs w:val="20"/>
           <w:lang w:val="en-US"/>
         </w:rPr>
       </w:pPr>
@@ -975,24 +992,32 @@
       <w:r>
         <w:rPr>
           <w:color w:val="auto"/>
+          <w:sz w:val="20"/>
+          <w:szCs w:val="20"/>
         </w:rPr>
         <w:t xml:space="preserve">Figure </w:t>
       </w:r>
       <w:r>
         <w:rPr>
           <w:color w:val="auto"/>
+          <w:sz w:val="20"/>
+          <w:szCs w:val="20"/>
         </w:rPr>
         <w:fldChar w:fldCharType="begin"/>
       </w:r>
       <w:r>
         <w:rPr>
           <w:color w:val="auto"/>
+          <w:sz w:val="20"/>
+          <w:szCs w:val="20"/>
         </w:rPr>
         <w:instrText xml:space="preserve"> SEQ Figure \* ARABIC </w:instrText>
       </w:r>
       <w:r>
         <w:rPr>
           <w:color w:val="auto"/>
+          <w:sz w:val="20"/>
+          <w:szCs w:val="20"/>
         </w:rPr>
         <w:fldChar w:fldCharType="separate"/>
       </w:r>
@@ -1000,12 +1025,16 @@
         <w:rPr>
           <w:noProof/>
           <w:color w:val="auto"/>
+          <w:sz w:val="20"/>
+          <w:szCs w:val="20"/>
         </w:rPr>
         <w:t>2</w:t>
       </w:r>
       <w:r>
         <w:rPr>
           <w:color w:val="auto"/>
+          <w:sz w:val="20"/>
+          <w:szCs w:val="20"/>
         </w:rPr>
         <w:fldChar w:fldCharType="end"/>
       </w:r>
@@ -1013,12 +1042,16 @@
       <w:r>
         <w:rPr>
           <w:color w:val="auto"/>
+          <w:sz w:val="20"/>
+          <w:szCs w:val="20"/>
         </w:rPr>
         <w:t xml:space="preserve"> </w:t>
       </w:r>
       <w:r>
         <w:rPr>
           <w:color w:val="auto"/>
+          <w:sz w:val="20"/>
+          <w:szCs w:val="20"/>
           <w:lang w:val="en-US"/>
         </w:rPr>
         <w:t>Density plot of Diameter at Breast Height (DBH) measurements</w:t>
@@ -1040,14 +1073,266 @@
     </w:p>
     <w:p>
       <w:pPr>
+        <w:pStyle w:val="Heading3"/>
         <w:rPr>
           <w:lang w:val="en-US"/>
         </w:rPr>
       </w:pPr>
+      <w:r>
+        <w:rPr>
+          <w:lang w:val="en-US"/>
+        </w:rPr>
+        <w:lastRenderedPageBreak/>
+        <w:t>Plot</w:t>
+      </w:r>
+    </w:p>
+    <w:p>
+      <w:pPr>
+        <w:jc w:val="both"/>
+        <w:rPr>
+          <w:sz w:val="24"/>
+          <w:szCs w:val="24"/>
+          <w:lang w:val="en-US"/>
+        </w:rPr>
+      </w:pPr>
+      <w:r>
+        <w:rPr>
+          <w:sz w:val="24"/>
+          <w:szCs w:val="24"/>
+          <w:lang w:val="en-US"/>
+        </w:rPr>
+        <w:t>Th</w:t>
+      </w:r>
+      <w:r>
+        <w:rPr>
+          <w:sz w:val="24"/>
+          <w:szCs w:val="24"/>
+          <w:lang w:val="en-US"/>
+        </w:rPr>
+        <w:t xml:space="preserve">is </w:t>
+      </w:r>
+      <w:r>
+        <w:rPr>
+          <w:sz w:val="24"/>
+          <w:szCs w:val="24"/>
+          <w:lang w:val="en-US"/>
+        </w:rPr>
+        <w:t>feature represents rectangular ground plots surveyed in the dataset. These plots are associated with both .</w:t>
+      </w:r>
+      <w:proofErr w:type="spellStart"/>
+      <w:r>
+        <w:rPr>
+          <w:sz w:val="24"/>
+          <w:szCs w:val="24"/>
+          <w:lang w:val="en-US"/>
+        </w:rPr>
+        <w:t>tif</w:t>
+      </w:r>
+      <w:proofErr w:type="spellEnd"/>
+      <w:r>
+        <w:rPr>
+          <w:sz w:val="24"/>
+          <w:szCs w:val="24"/>
+          <w:lang w:val="en-US"/>
+        </w:rPr>
+        <w:t xml:space="preserve"> and .las files. </w:t>
+      </w:r>
+      <w:r>
+        <w:rPr>
+          <w:lang w:val="en-US"/>
+        </w:rPr>
+        <w:fldChar w:fldCharType="begin"/>
+      </w:r>
+      <w:r>
+        <w:rPr>
+          <w:lang w:val="en-US"/>
+        </w:rPr>
+        <w:instrText xml:space="preserve"> REF _Ref186809469 \h </w:instrText>
+      </w:r>
+      <w:r>
+        <w:rPr>
+          <w:lang w:val="en-US"/>
+        </w:rPr>
+      </w:r>
+      <w:r>
+        <w:rPr>
+          <w:lang w:val="en-US"/>
+        </w:rPr>
+        <w:instrText xml:space="preserve"> \* MERGEFORMAT </w:instrText>
+      </w:r>
+      <w:r>
+        <w:rPr>
+          <w:lang w:val="en-US"/>
+        </w:rPr>
+        <w:fldChar w:fldCharType="separate"/>
+      </w:r>
+      <w:r>
+        <w:t xml:space="preserve">Figure </w:t>
+      </w:r>
+      <w:r>
+        <w:rPr>
+          <w:noProof/>
+        </w:rPr>
+        <w:t>3</w:t>
+      </w:r>
+      <w:r>
+        <w:rPr>
+          <w:lang w:val="en-US"/>
+        </w:rPr>
+        <w:fldChar w:fldCharType="end"/>
+      </w:r>
+      <w:r>
+        <w:rPr>
+          <w:sz w:val="24"/>
+          <w:szCs w:val="24"/>
+          <w:lang w:val="en-US"/>
+        </w:rPr>
+        <w:t xml:space="preserve"> </w:t>
+      </w:r>
+      <w:r>
+        <w:rPr>
+          <w:sz w:val="24"/>
+          <w:szCs w:val="24"/>
+          <w:lang w:val="en-US"/>
+        </w:rPr>
+        <w:t>illustrates the distribution of tree species across these 10 plots. Each point represents an individual tree, color-coded by its species. The plots reveal varying species compositions, with some plots dominated by specific species. For instance, Plot 1 is largely populated with Aspens, while Plot 7 shows a predominance of Birch trees.</w:t>
+      </w:r>
+      <w:bookmarkStart w:id="2" w:name="_Ref186809469"/>
+    </w:p>
+    <w:p>
+      <w:pPr>
+        <w:jc w:val="both"/>
+        <w:rPr>
+          <w:sz w:val="24"/>
+          <w:szCs w:val="24"/>
+          <w:lang w:val="en-US"/>
+        </w:rPr>
+      </w:pPr>
+    </w:p>
+    <w:bookmarkEnd w:id="2"/>
+    <w:p>
+      <w:pPr>
+        <w:pStyle w:val="Caption"/>
+        <w:keepNext/>
+        <w:jc w:val="center"/>
+      </w:pPr>
+      <w:r>
+        <w:rPr>
+          <w:color w:val="auto"/>
+          <w:sz w:val="20"/>
+          <w:szCs w:val="20"/>
+          <w:lang w:val="en-US"/>
+        </w:rPr>
+        <w:drawing>
+          <wp:inline distT="0" distB="0" distL="0" distR="0" wp14:anchorId="1E3D0653" wp14:editId="2A029B83">
+            <wp:extent cx="5943600" cy="5269865"/>
+            <wp:effectExtent l="0" t="0" r="0" b="6985"/>
+            <wp:docPr id="1186574551" name="Picture 1" descr="A screenshot of a computer screen&#10;&#10;Description automatically generated"/>
+            <wp:cNvGraphicFramePr>
+              <a:graphicFrameLocks xmlns:a="http://schemas.openxmlformats.org/drawingml/2006/main" noChangeAspect="1"/>
+            </wp:cNvGraphicFramePr>
+            <a:graphic xmlns:a="http://schemas.openxmlformats.org/drawingml/2006/main">
+              <a:graphicData uri="http://schemas.openxmlformats.org/drawingml/2006/picture">
+                <pic:pic xmlns:pic="http://schemas.openxmlformats.org/drawingml/2006/picture">
+                  <pic:nvPicPr>
+                    <pic:cNvPr id="1186574551" name="Picture 1" descr="A screenshot of a computer screen&#10;&#10;Description automatically generated"/>
+                    <pic:cNvPicPr/>
+                  </pic:nvPicPr>
+                  <pic:blipFill>
+                    <a:blip r:embed="rId12"/>
+                    <a:stretch>
+                      <a:fillRect/>
+                    </a:stretch>
+                  </pic:blipFill>
+                  <pic:spPr>
+                    <a:xfrm>
+                      <a:off x="0" y="0"/>
+                      <a:ext cx="5943600" cy="5269865"/>
+                    </a:xfrm>
+                    <a:prstGeom prst="rect">
+                      <a:avLst/>
+                    </a:prstGeom>
+                  </pic:spPr>
+                </pic:pic>
+              </a:graphicData>
+            </a:graphic>
+          </wp:inline>
+        </w:drawing>
+      </w:r>
+    </w:p>
+    <w:p>
+      <w:pPr>
+        <w:pStyle w:val="Caption"/>
+        <w:jc w:val="center"/>
+        <w:rPr>
+          <w:color w:val="auto"/>
+          <w:sz w:val="22"/>
+          <w:szCs w:val="22"/>
+          <w:lang w:val="en-US"/>
+        </w:rPr>
+      </w:pPr>
+      <w:r>
+        <w:rPr>
+          <w:color w:val="auto"/>
+          <w:sz w:val="20"/>
+          <w:szCs w:val="20"/>
+        </w:rPr>
+        <w:t xml:space="preserve">Figure </w:t>
+      </w:r>
+      <w:r>
+        <w:rPr>
+          <w:color w:val="auto"/>
+          <w:sz w:val="20"/>
+          <w:szCs w:val="20"/>
+        </w:rPr>
+        <w:fldChar w:fldCharType="begin"/>
+      </w:r>
+      <w:r>
+        <w:rPr>
+          <w:color w:val="auto"/>
+          <w:sz w:val="20"/>
+          <w:szCs w:val="20"/>
+        </w:rPr>
+        <w:instrText xml:space="preserve"> SEQ Figure \* ARABIC </w:instrText>
+      </w:r>
+      <w:r>
+        <w:rPr>
+          <w:color w:val="auto"/>
+          <w:sz w:val="20"/>
+          <w:szCs w:val="20"/>
+        </w:rPr>
+        <w:fldChar w:fldCharType="separate"/>
+      </w:r>
+      <w:r>
+        <w:rPr>
+          <w:noProof/>
+          <w:color w:val="auto"/>
+          <w:sz w:val="20"/>
+          <w:szCs w:val="20"/>
+        </w:rPr>
+        <w:t>3</w:t>
+      </w:r>
+      <w:r>
+        <w:rPr>
+          <w:color w:val="auto"/>
+          <w:sz w:val="20"/>
+          <w:szCs w:val="20"/>
+        </w:rPr>
+        <w:fldChar w:fldCharType="end"/>
+      </w:r>
+      <w:r>
+        <w:rPr>
+          <w:color w:val="auto"/>
+          <w:sz w:val="20"/>
+          <w:szCs w:val="20"/>
+          <w:lang w:val="fr-FR"/>
+        </w:rPr>
+        <w:t xml:space="preserve"> Species Distribution Across Plots 1 to 10</w:t>
+      </w:r>
     </w:p>
     <w:sectPr>
-      <w:headerReference w:type="default" r:id="rId12"/>
-      <w:footerReference w:type="default" r:id="rId13"/>
+      <w:headerReference w:type="default" r:id="rId13"/>
+      <w:footerReference w:type="default" r:id="rId14"/>
       <w:pgSz w:w="12240" w:h="15840"/>
       <w:pgMar w:top="1440" w:right="1440" w:bottom="1440" w:left="1440" w:header="720" w:footer="720" w:gutter="0"/>
       <w:pgNumType w:start="1"/>

</xml_diff>

<commit_message>
one juoiter file deleted
</commit_message>
<xml_diff>
--- a/Report.docx
+++ b/Report.docx
@@ -1266,8 +1266,8 @@
         <w:jc w:val="center"/>
         <w:rPr>
           <w:color w:val="auto"/>
-          <w:sz w:val="22"/>
-          <w:szCs w:val="22"/>
+          <w:sz w:val="20"/>
+          <w:szCs w:val="20"/>
           <w:lang w:val="en-US"/>
         </w:rPr>
       </w:pPr>
@@ -1325,10 +1325,45 @@
           <w:color w:val="auto"/>
           <w:sz w:val="20"/>
           <w:szCs w:val="20"/>
-          <w:lang w:val="fr-FR"/>
+          <w:lang w:val="en-US"/>
         </w:rPr>
         <w:t xml:space="preserve"> Species Distribution Across Plots 1 to 10</w:t>
       </w:r>
+    </w:p>
+    <w:p>
+      <w:pPr>
+        <w:rPr>
+          <w:lang w:val="en-US"/>
+        </w:rPr>
+      </w:pPr>
+    </w:p>
+    <w:p>
+      <w:pPr>
+        <w:rPr>
+          <w:lang w:val="en-US"/>
+        </w:rPr>
+      </w:pPr>
+    </w:p>
+    <w:p>
+      <w:pPr>
+        <w:rPr>
+          <w:lang w:val="en-US"/>
+        </w:rPr>
+      </w:pPr>
+    </w:p>
+    <w:p>
+      <w:pPr>
+        <w:rPr>
+          <w:lang w:val="en-US"/>
+        </w:rPr>
+      </w:pPr>
+    </w:p>
+    <w:p>
+      <w:pPr>
+        <w:rPr>
+          <w:lang w:val="en-US"/>
+        </w:rPr>
+      </w:pPr>
     </w:p>
     <w:sectPr>
       <w:headerReference w:type="default" r:id="rId13"/>

</xml_diff>